<commit_message>
moslty completed the peooject
</commit_message>
<xml_diff>
--- a/backend/templates/health_certificate.docx
+++ b/backend/templates/health_certificate.docx
@@ -2635,6 +2635,7 @@
     </w:p>
     <w:p>
       <w:pPr>
+        <w:spacing w:after="40"/>
         <w:ind w:right="0" w:firstLine="720"/>
         <w:rPr>
           <w:rFonts w:ascii="Bookman Old Style" w:hAnsi="Bookman Old Style"/>
@@ -2690,6 +2691,7 @@
     </w:p>
     <w:p>
       <w:pPr>
+        <w:spacing w:after="40"/>
         <w:ind w:right="0" w:firstLine="720"/>
         <w:rPr>
           <w:rFonts w:ascii="Bookman Old Style" w:hAnsi="Bookman Old Style"/>
@@ -2783,6 +2785,7 @@
     </w:p>
     <w:p>
       <w:pPr>
+        <w:spacing w:after="40"/>
         <w:ind w:right="0" w:firstLine="720"/>
         <w:rPr>
           <w:rFonts w:ascii="Bookman Old Style" w:hAnsi="Bookman Old Style"/>
@@ -2862,6 +2865,7 @@
     </w:p>
     <w:p>
       <w:pPr>
+        <w:spacing w:after="40"/>
         <w:ind w:right="0" w:firstLine="720"/>
         <w:rPr>
           <w:rFonts w:ascii="Bookman Old Style" w:hAnsi="Bookman Old Style"/>
@@ -2967,6 +2971,7 @@
     </w:p>
     <w:p>
       <w:pPr>
+        <w:spacing w:after="40"/>
         <w:ind w:right="0" w:firstLine="720"/>
         <w:rPr>
           <w:rFonts w:ascii="Bookman Old Style" w:hAnsi="Bookman Old Style"/>
@@ -3006,6 +3011,7 @@
     <w:p>
       <w:pPr>
         <w:pStyle w:val="NoSpacing"/>
+        <w:spacing w:after="40"/>
         <w:ind w:firstLine="720"/>
         <w:jc w:val="both"/>
         <w:rPr>
@@ -3046,6 +3052,7 @@
     <w:p>
       <w:pPr>
         <w:pStyle w:val="NoSpacing"/>
+        <w:spacing w:before="0" w:after="0" w:lineRule="exact" w:line="20"/>
         <w:ind w:firstLine="720"/>
         <w:jc w:val="both"/>
         <w:rPr>
@@ -3055,6 +3062,7 @@
     </w:p>
     <w:p>
       <w:pPr>
+        <w:spacing w:before="0" w:after="0" w:lineRule="exact" w:line="20"/>
         <w:ind w:left="5040" w:right="0"/>
         <w:rPr>
           <w:rFonts w:ascii="Bookman Old Style" w:hAnsi="Bookman Old Style"/>
@@ -3065,6 +3073,7 @@
     </w:p>
     <w:p>
       <w:pPr>
+        <w:spacing w:before="0" w:after="0" w:lineRule="exact" w:line="20"/>
         <w:ind w:left="5040" w:right="0"/>
         <w:rPr>
           <w:rFonts w:ascii="Bookman Old Style" w:hAnsi="Bookman Old Style"/>
@@ -3075,6 +3084,7 @@
     </w:p>
     <w:p>
       <w:pPr>
+        <w:spacing w:before="0" w:after="0" w:lineRule="exact" w:line="20"/>
         <w:ind w:left="5040" w:right="0"/>
         <w:rPr>
           <w:rFonts w:ascii="Bookman Old Style" w:hAnsi="Bookman Old Style"/>
@@ -3085,38 +3095,39 @@
       <w:r>
         <w:rPr>
           <w:rFonts w:ascii="Bookman Old Style" w:hAnsi="Bookman Old Style"/>
-          <w:sz w:val="20"/>
-          <w:szCs w:val="20"/>
-        </w:rPr>
-        <w:tab/>
-      </w:r>
-      <w:r>
-        <w:rPr>
-          <w:rFonts w:ascii="Bookman Old Style" w:hAnsi="Bookman Old Style"/>
-          <w:sz w:val="20"/>
-          <w:szCs w:val="20"/>
-        </w:rPr>
-        <w:tab/>
-      </w:r>
-      <w:r>
-        <w:rPr>
-          <w:rFonts w:ascii="Bookman Old Style" w:hAnsi="Bookman Old Style"/>
-          <w:sz w:val="20"/>
-          <w:szCs w:val="20"/>
-        </w:rPr>
-        <w:tab/>
-      </w:r>
-      <w:r>
-        <w:rPr>
-          <w:rFonts w:ascii="Bookman Old Style" w:hAnsi="Bookman Old Style"/>
-          <w:sz w:val="20"/>
-          <w:szCs w:val="20"/>
-        </w:rPr>
-        <w:tab/>
-      </w:r>
-    </w:p>
-    <w:p>
-      <w:pPr>
+          <w:sz w:val="2"/>
+          <w:szCs w:val="20"/>
+        </w:rPr>
+        <w:tab/>
+      </w:r>
+      <w:r>
+        <w:rPr>
+          <w:rFonts w:ascii="Bookman Old Style" w:hAnsi="Bookman Old Style"/>
+          <w:sz w:val="2"/>
+          <w:szCs w:val="20"/>
+        </w:rPr>
+        <w:tab/>
+      </w:r>
+      <w:r>
+        <w:rPr>
+          <w:rFonts w:ascii="Bookman Old Style" w:hAnsi="Bookman Old Style"/>
+          <w:sz w:val="2"/>
+          <w:szCs w:val="20"/>
+        </w:rPr>
+        <w:tab/>
+      </w:r>
+      <w:r>
+        <w:rPr>
+          <w:rFonts w:ascii="Bookman Old Style" w:hAnsi="Bookman Old Style"/>
+          <w:sz w:val="2"/>
+          <w:szCs w:val="20"/>
+        </w:rPr>
+        <w:tab/>
+      </w:r>
+    </w:p>
+    <w:p>
+      <w:pPr>
+        <w:spacing w:before="0" w:after="0" w:lineRule="exact" w:line="20"/>
         <w:ind w:left="5040" w:right="0"/>
         <w:rPr>
           <w:rFonts w:ascii="Bookman Old Style" w:hAnsi="Bookman Old Style"/>
@@ -3127,7 +3138,7 @@
       <w:r>
         <w:rPr>
           <w:rFonts w:ascii="Bookman Old Style" w:hAnsi="Bookman Old Style"/>
-          <w:sz w:val="20"/>
+          <w:sz w:val="2"/>
           <w:szCs w:val="20"/>
         </w:rPr>
         <w:tab/>
@@ -3209,6 +3220,7 @@
     </w:p>
     <w:p>
       <w:pPr>
+        <w:spacing w:before="0" w:after="0" w:lineRule="exact" w:line="20"/>
         <w:ind w:right="0"/>
         <w:rPr>
           <w:rFonts w:ascii="Bookman Old Style" w:hAnsi="Bookman Old Style"/>
@@ -3219,55 +3231,55 @@
       <w:r>
         <w:rPr>
           <w:rFonts w:ascii="Bookman Old Style" w:hAnsi="Bookman Old Style"/>
-          <w:sz w:val="20"/>
-          <w:szCs w:val="20"/>
-        </w:rPr>
-        <w:tab/>
-      </w:r>
-      <w:r>
-        <w:rPr>
-          <w:rFonts w:ascii="Bookman Old Style" w:hAnsi="Bookman Old Style"/>
-          <w:sz w:val="20"/>
-          <w:szCs w:val="20"/>
-        </w:rPr>
-        <w:tab/>
-      </w:r>
-      <w:r>
-        <w:rPr>
-          <w:rFonts w:ascii="Bookman Old Style" w:hAnsi="Bookman Old Style"/>
-          <w:sz w:val="20"/>
-          <w:szCs w:val="20"/>
-        </w:rPr>
-        <w:tab/>
-      </w:r>
-      <w:r>
-        <w:rPr>
-          <w:rFonts w:ascii="Bookman Old Style" w:hAnsi="Bookman Old Style"/>
-          <w:sz w:val="20"/>
-          <w:szCs w:val="20"/>
-        </w:rPr>
-        <w:tab/>
-      </w:r>
-      <w:r>
-        <w:rPr>
-          <w:rFonts w:ascii="Bookman Old Style" w:hAnsi="Bookman Old Style"/>
-          <w:sz w:val="20"/>
-          <w:szCs w:val="20"/>
-        </w:rPr>
-        <w:tab/>
-      </w:r>
-      <w:r>
-        <w:rPr>
-          <w:rFonts w:ascii="Bookman Old Style" w:hAnsi="Bookman Old Style"/>
-          <w:sz w:val="20"/>
-          <w:szCs w:val="20"/>
-        </w:rPr>
-        <w:tab/>
-      </w:r>
-      <w:r>
-        <w:rPr>
-          <w:rFonts w:ascii="Bookman Old Style" w:hAnsi="Bookman Old Style"/>
-          <w:sz w:val="20"/>
+          <w:sz w:val="2"/>
+          <w:szCs w:val="20"/>
+        </w:rPr>
+        <w:tab/>
+      </w:r>
+      <w:r>
+        <w:rPr>
+          <w:rFonts w:ascii="Bookman Old Style" w:hAnsi="Bookman Old Style"/>
+          <w:sz w:val="2"/>
+          <w:szCs w:val="20"/>
+        </w:rPr>
+        <w:tab/>
+      </w:r>
+      <w:r>
+        <w:rPr>
+          <w:rFonts w:ascii="Bookman Old Style" w:hAnsi="Bookman Old Style"/>
+          <w:sz w:val="2"/>
+          <w:szCs w:val="20"/>
+        </w:rPr>
+        <w:tab/>
+      </w:r>
+      <w:r>
+        <w:rPr>
+          <w:rFonts w:ascii="Bookman Old Style" w:hAnsi="Bookman Old Style"/>
+          <w:sz w:val="2"/>
+          <w:szCs w:val="20"/>
+        </w:rPr>
+        <w:tab/>
+      </w:r>
+      <w:r>
+        <w:rPr>
+          <w:rFonts w:ascii="Bookman Old Style" w:hAnsi="Bookman Old Style"/>
+          <w:sz w:val="2"/>
+          <w:szCs w:val="20"/>
+        </w:rPr>
+        <w:tab/>
+      </w:r>
+      <w:r>
+        <w:rPr>
+          <w:rFonts w:ascii="Bookman Old Style" w:hAnsi="Bookman Old Style"/>
+          <w:sz w:val="2"/>
+          <w:szCs w:val="20"/>
+        </w:rPr>
+        <w:tab/>
+      </w:r>
+      <w:r>
+        <w:rPr>
+          <w:rFonts w:ascii="Bookman Old Style" w:hAnsi="Bookman Old Style"/>
+          <w:sz w:val="2"/>
           <w:szCs w:val="20"/>
         </w:rPr>
         <w:tab/>

</xml_diff>